<commit_message>
Update Arbabic translation notes for 2026-09-14 release
</commit_message>
<xml_diff>
--- a/arb/docx/08.content.docx
+++ b/arb/docx/08.content.docx
@@ -27208,20 +27208,14 @@
         </w:rPr>
         <w:t xml:space="preserve">أوضح سؤال نُعمي البلاغي في </w:t>
       </w:r>
-      <w:hyperlink r:id="rId13">
-        <w:r>
-          <w:rPr>
-            <w:rtl/>
-            <w:cs/>
-            <w:lang w:val="ar_AE" w:bidi="ar_AE"/>
-          </w:rPr>
-          <w:rPr>
-            <w:color w:val="0000EE"/>
-            <w:u w:val="single"/>
-          </w:rPr>
-          <w:t>3:1</w:t>
-        </w:r>
-      </w:hyperlink>
+      <w:r>
+        <w:rPr>
+          <w:rtl/>
+          <w:cs/>
+          <w:lang w:val="ar_AE" w:bidi="ar_AE"/>
+        </w:rPr>
+        <w:t>3:1</w:t>
+      </w:r>
       <w:r>
         <w:rPr>
           <w:rtl/>
@@ -27230,20 +27224,14 @@
         </w:rPr>
         <w:t xml:space="preserve"> سبب الخطة التي ستخبر بها راعوث في الآيات </w:t>
       </w:r>
-      <w:hyperlink r:id="rId14">
-        <w:r>
-          <w:rPr>
-            <w:rtl/>
-            <w:cs/>
-            <w:lang w:val="ar_AE" w:bidi="ar_AE"/>
-          </w:rPr>
-          <w:rPr>
-            <w:color w:val="0000EE"/>
-            <w:u w:val="single"/>
-          </w:rPr>
-          <w:t>3:2–4</w:t>
-        </w:r>
-      </w:hyperlink>
+      <w:r>
+        <w:rPr>
+          <w:rtl/>
+          <w:cs/>
+          <w:lang w:val="ar_AE" w:bidi="ar_AE"/>
+        </w:rPr>
+        <w:t>3:2–4</w:t>
+      </w:r>
       <w:r>
         <w:rPr>
           <w:rtl/>
@@ -27406,20 +27394,14 @@
         </w:rPr>
         <w:t xml:space="preserve">تستخدم نعمي صيغة السؤال هنا لتذكير راعوث بأمر كانت قد أخبرتها به سابقًا (انظر </w:t>
       </w:r>
-      <w:hyperlink r:id="rId15">
-        <w:r>
-          <w:rPr>
-            <w:rtl/>
-            <w:cs/>
-            <w:lang w:val="ar_AE" w:bidi="ar_AE"/>
-          </w:rPr>
-          <w:rPr>
-            <w:color w:val="0000EE"/>
-            <w:u w:val="single"/>
-          </w:rPr>
-          <w:t>2:20</w:t>
-        </w:r>
-      </w:hyperlink>
+      <w:r>
+        <w:rPr>
+          <w:rtl/>
+          <w:cs/>
+          <w:lang w:val="ar_AE" w:bidi="ar_AE"/>
+        </w:rPr>
+        <w:t>2:20</w:t>
+      </w:r>
       <w:r>
         <w:rPr>
           <w:rtl/>
@@ -29104,20 +29086,14 @@
         </w:rPr>
         <w:t xml:space="preserve">تُلخص هذه العبارة الأفعال التي ستقوم بها راعوث في </w:t>
       </w:r>
-      <w:hyperlink r:id="rId16">
-        <w:r>
-          <w:rPr>
-            <w:rtl/>
-            <w:cs/>
-            <w:lang w:val="ar_AE" w:bidi="ar_AE"/>
-          </w:rPr>
-          <w:rPr>
-            <w:color w:val="0000EE"/>
-            <w:u w:val="single"/>
-          </w:rPr>
-          <w:t>3:7</w:t>
-        </w:r>
-      </w:hyperlink>
+      <w:r>
+        <w:rPr>
+          <w:rtl/>
+          <w:cs/>
+          <w:lang w:val="ar_AE" w:bidi="ar_AE"/>
+        </w:rPr>
+        <w:t>3:7</w:t>
+      </w:r>
       <w:r>
         <w:rPr>
           <w:rtl/>
@@ -29126,20 +29102,14 @@
         </w:rPr>
         <w:t xml:space="preserve">. إذا أساء الناس فهم ذلك وظنوا أن راعوث قامت بهذه الأفعال في </w:t>
       </w:r>
-      <w:hyperlink r:id="rId17">
-        <w:r>
-          <w:rPr>
-            <w:rtl/>
-            <w:cs/>
-            <w:lang w:val="ar_AE" w:bidi="ar_AE"/>
-          </w:rPr>
-          <w:rPr>
-            <w:color w:val="0000EE"/>
-            <w:u w:val="single"/>
-          </w:rPr>
-          <w:t>3:6</w:t>
-        </w:r>
-      </w:hyperlink>
+      <w:r>
+        <w:rPr>
+          <w:rtl/>
+          <w:cs/>
+          <w:lang w:val="ar_AE" w:bidi="ar_AE"/>
+        </w:rPr>
+        <w:t>3:6</w:t>
+      </w:r>
       <w:r>
         <w:rPr>
           <w:rtl/>
@@ -29148,20 +29118,14 @@
         </w:rPr>
         <w:t xml:space="preserve"> ثم أعادتها مرة أخرى في </w:t>
       </w:r>
-      <w:hyperlink r:id="rId16">
-        <w:r>
-          <w:rPr>
-            <w:rtl/>
-            <w:cs/>
-            <w:lang w:val="ar_AE" w:bidi="ar_AE"/>
-          </w:rPr>
-          <w:rPr>
-            <w:color w:val="0000EE"/>
-            <w:u w:val="single"/>
-          </w:rPr>
-          <w:t>3:7</w:t>
-        </w:r>
-      </w:hyperlink>
+      <w:r>
+        <w:rPr>
+          <w:rtl/>
+          <w:cs/>
+          <w:lang w:val="ar_AE" w:bidi="ar_AE"/>
+        </w:rPr>
+        <w:t>3:7</w:t>
+      </w:r>
       <w:r>
         <w:rPr>
           <w:rtl/>
@@ -29187,20 +29151,14 @@
         </w:rPr>
         <w:t xml:space="preserve">. أو لتوضيح ترتيب الأحداث بشكل أفضل، يمكنك نقل هذه الجملة إلى نهاية </w:t>
       </w:r>
-      <w:hyperlink r:id="rId16">
-        <w:r>
-          <w:rPr>
-            <w:rtl/>
-            <w:cs/>
-            <w:lang w:val="ar_AE" w:bidi="ar_AE"/>
-          </w:rPr>
-          <w:rPr>
-            <w:color w:val="0000EE"/>
-            <w:u w:val="single"/>
-          </w:rPr>
-          <w:t>3:7</w:t>
-        </w:r>
-      </w:hyperlink>
+      <w:r>
+        <w:rPr>
+          <w:rtl/>
+          <w:cs/>
+          <w:lang w:val="ar_AE" w:bidi="ar_AE"/>
+        </w:rPr>
+        <w:t>3:7</w:t>
+      </w:r>
       <w:r>
         <w:rPr>
           <w:rtl/>
@@ -29677,20 +29635,14 @@
         </w:rPr>
         <w:t xml:space="preserve">في </w:t>
       </w:r>
-      <w:hyperlink r:id="rId18">
-        <w:r>
-          <w:rPr>
-            <w:rtl/>
-            <w:cs/>
-            <w:lang w:val="ar_AE" w:bidi="ar_AE"/>
-          </w:rPr>
-          <w:rPr>
-            <w:color w:val="0000EE"/>
-            <w:u w:val="single"/>
-          </w:rPr>
-          <w:t>3:4</w:t>
-        </w:r>
-      </w:hyperlink>
+      <w:r>
+        <w:rPr>
+          <w:rtl/>
+          <w:cs/>
+          <w:lang w:val="ar_AE" w:bidi="ar_AE"/>
+        </w:rPr>
+        <w:t>3:4</w:t>
+      </w:r>
       <w:r>
         <w:rPr>
           <w:rtl/>
@@ -30658,20 +30610,14 @@
         </w:rPr>
         <w:t xml:space="preserve">انظر كيف قُمت بترجمة هذا المصطلح في </w:t>
       </w:r>
-      <w:hyperlink r:id="rId15">
-        <w:r>
-          <w:rPr>
-            <w:rtl/>
-            <w:cs/>
-            <w:lang w:val="ar_AE" w:bidi="ar_AE"/>
-          </w:rPr>
-          <w:rPr>
-            <w:color w:val="0000EE"/>
-            <w:u w:val="single"/>
-          </w:rPr>
-          <w:t>2:20</w:t>
-        </w:r>
-      </w:hyperlink>
+      <w:r>
+        <w:rPr>
+          <w:rtl/>
+          <w:cs/>
+          <w:lang w:val="ar_AE" w:bidi="ar_AE"/>
+        </w:rPr>
+        <w:t>2:20</w:t>
+      </w:r>
       <w:r>
         <w:rPr>
           <w:rtl/>
@@ -31005,20 +30951,14 @@
         </w:rPr>
         <w:t xml:space="preserve">في </w:t>
       </w:r>
-      <w:hyperlink r:id="rId19">
-        <w:r>
-          <w:rPr>
-            <w:rtl/>
-            <w:cs/>
-            <w:lang w:val="ar_AE" w:bidi="ar_AE"/>
-          </w:rPr>
-          <w:rPr>
-            <w:color w:val="0000EE"/>
-            <w:u w:val="single"/>
-          </w:rPr>
-          <w:t>2:8</w:t>
-        </w:r>
-      </w:hyperlink>
+      <w:r>
+        <w:rPr>
+          <w:rtl/>
+          <w:cs/>
+          <w:lang w:val="ar_AE" w:bidi="ar_AE"/>
+        </w:rPr>
+        <w:t>2:8</w:t>
+      </w:r>
       <w:r>
         <w:rPr>
           <w:rtl/>
@@ -31694,20 +31634,14 @@
         </w:rPr>
         <w:t xml:space="preserve"> إلى أن ما ورد في الآية </w:t>
       </w:r>
-      <w:hyperlink r:id="rId20">
-        <w:r>
-          <w:rPr>
-            <w:rtl/>
-            <w:cs/>
-            <w:lang w:val="ar_AE" w:bidi="ar_AE"/>
-          </w:rPr>
-          <w:rPr>
-            <w:color w:val="0000EE"/>
-            <w:u w:val="single"/>
-          </w:rPr>
-          <w:t>3:10</w:t>
-        </w:r>
-      </w:hyperlink>
+      <w:r>
+        <w:rPr>
+          <w:rtl/>
+          <w:cs/>
+          <w:lang w:val="ar_AE" w:bidi="ar_AE"/>
+        </w:rPr>
+        <w:t>3:10</w:t>
+      </w:r>
       <w:r>
         <w:rPr>
           <w:rtl/>
@@ -31870,20 +31804,14 @@
         </w:rPr>
         <w:t xml:space="preserve">انظر كيف قُمت بترجمة هذا التعبير في </w:t>
       </w:r>
-      <w:hyperlink r:id="rId19">
-        <w:r>
-          <w:rPr>
-            <w:rtl/>
-            <w:cs/>
-            <w:lang w:val="ar_AE" w:bidi="ar_AE"/>
-          </w:rPr>
-          <w:rPr>
-            <w:color w:val="0000EE"/>
-            <w:u w:val="single"/>
-          </w:rPr>
-          <w:t>2:8</w:t>
-        </w:r>
-      </w:hyperlink>
+      <w:r>
+        <w:rPr>
+          <w:rtl/>
+          <w:cs/>
+          <w:lang w:val="ar_AE" w:bidi="ar_AE"/>
+        </w:rPr>
+        <w:t>2:8</w:t>
+      </w:r>
       <w:r>
         <w:rPr>
           <w:rtl/>
@@ -31892,20 +31820,14 @@
         </w:rPr>
         <w:t xml:space="preserve"> و</w:t>
       </w:r>
-      <w:hyperlink r:id="rId20">
-        <w:r>
-          <w:rPr>
-            <w:rtl/>
-            <w:cs/>
-            <w:lang w:val="ar_AE" w:bidi="ar_AE"/>
-          </w:rPr>
-          <w:rPr>
-            <w:color w:val="0000EE"/>
-            <w:u w:val="single"/>
-          </w:rPr>
-          <w:t>3:10</w:t>
-        </w:r>
-      </w:hyperlink>
+      <w:r>
+        <w:rPr>
+          <w:rtl/>
+          <w:cs/>
+          <w:lang w:val="ar_AE" w:bidi="ar_AE"/>
+        </w:rPr>
+        <w:t>3:10</w:t>
+      </w:r>
       <w:r>
         <w:rPr>
           <w:rtl/>
@@ -32410,20 +32332,14 @@
         </w:rPr>
         <w:t xml:space="preserve"> إلى أن ما سيأتي بعد ذلك هو أمر آخر مهم يجب على راعوث الانتباه إليه، وكذلك ما ذكره بوعز بقوله "والآن" في </w:t>
       </w:r>
-      <w:hyperlink r:id="rId21">
-        <w:r>
-          <w:rPr>
-            <w:rtl/>
-            <w:cs/>
-            <w:lang w:val="ar_AE" w:bidi="ar_AE"/>
-          </w:rPr>
-          <w:rPr>
-            <w:color w:val="0000EE"/>
-            <w:u w:val="single"/>
-          </w:rPr>
-          <w:t>3:11</w:t>
-        </w:r>
-      </w:hyperlink>
+      <w:r>
+        <w:rPr>
+          <w:rtl/>
+          <w:cs/>
+          <w:lang w:val="ar_AE" w:bidi="ar_AE"/>
+        </w:rPr>
+        <w:t>3:11</w:t>
+      </w:r>
       <w:r>
         <w:rPr>
           <w:rtl/>
@@ -32603,20 +32519,14 @@
         </w:rPr>
         <w:t xml:space="preserve">إلى التباين بين استعداد بوعز للزواج من راعوث </w:t>
       </w:r>
-      <w:hyperlink r:id="rId21">
-        <w:r>
-          <w:rPr>
-            <w:rtl/>
-            <w:cs/>
-            <w:lang w:val="ar_AE" w:bidi="ar_AE"/>
-          </w:rPr>
-          <w:rPr>
-            <w:color w:val="0000EE"/>
-            <w:u w:val="single"/>
-          </w:rPr>
-          <w:t>3:11</w:t>
-        </w:r>
-      </w:hyperlink>
+      <w:r>
+        <w:rPr>
+          <w:rtl/>
+          <w:cs/>
+          <w:lang w:val="ar_AE" w:bidi="ar_AE"/>
+        </w:rPr>
+        <w:t>3:11</w:t>
+      </w:r>
       <w:r>
         <w:rPr>
           <w:rtl/>
@@ -32625,20 +32535,14 @@
         </w:rPr>
         <w:t xml:space="preserve"> وبين إمكانية زواج رجل آخر منها </w:t>
       </w:r>
-      <w:hyperlink r:id="rId22">
-        <w:r>
-          <w:rPr>
-            <w:rtl/>
-            <w:cs/>
-            <w:lang w:val="ar_AE" w:bidi="ar_AE"/>
-          </w:rPr>
-          <w:rPr>
-            <w:color w:val="0000EE"/>
-            <w:u w:val="single"/>
-          </w:rPr>
-          <w:t>3:12</w:t>
-        </w:r>
-      </w:hyperlink>
+      <w:r>
+        <w:rPr>
+          <w:rtl/>
+          <w:cs/>
+          <w:lang w:val="ar_AE" w:bidi="ar_AE"/>
+        </w:rPr>
+        <w:t>3:12</w:t>
+      </w:r>
       <w:r>
         <w:rPr>
           <w:rtl/>
@@ -32836,20 +32740,14 @@
         </w:rPr>
         <w:t xml:space="preserve">في </w:t>
       </w:r>
-      <w:hyperlink r:id="rId15">
-        <w:r>
-          <w:rPr>
-            <w:rtl/>
-            <w:cs/>
-            <w:lang w:val="ar_AE" w:bidi="ar_AE"/>
-          </w:rPr>
-          <w:rPr>
-            <w:color w:val="0000EE"/>
-            <w:u w:val="single"/>
-          </w:rPr>
-          <w:t>2:20</w:t>
-        </w:r>
-      </w:hyperlink>
+      <w:r>
+        <w:rPr>
+          <w:rtl/>
+          <w:cs/>
+          <w:lang w:val="ar_AE" w:bidi="ar_AE"/>
+        </w:rPr>
+        <w:t>2:20</w:t>
+      </w:r>
       <w:r>
         <w:rPr>
           <w:rtl/>
@@ -35345,20 +35243,14 @@
         </w:rPr>
         <w:t xml:space="preserve">انظر كيف قُمت بترجمة هذه العبارة في </w:t>
       </w:r>
-      <w:hyperlink r:id="rId23">
-        <w:r>
-          <w:rPr>
-            <w:rtl/>
-            <w:cs/>
-            <w:lang w:val="ar_AE" w:bidi="ar_AE"/>
-          </w:rPr>
-          <w:rPr>
-            <w:color w:val="0000EE"/>
-            <w:u w:val="single"/>
-          </w:rPr>
-          <w:t>3:15</w:t>
-        </w:r>
-      </w:hyperlink>
+      <w:r>
+        <w:rPr>
+          <w:rtl/>
+          <w:cs/>
+          <w:lang w:val="ar_AE" w:bidi="ar_AE"/>
+        </w:rPr>
+        <w:t>3:15</w:t>
+      </w:r>
       <w:r>
         <w:rPr>
           <w:rtl/>
@@ -37443,20 +37335,14 @@
         </w:rPr>
         <w:t xml:space="preserve">في </w:t>
       </w:r>
-      <w:hyperlink r:id="rId15">
-        <w:r>
-          <w:rPr>
-            <w:rtl/>
-            <w:cs/>
-            <w:lang w:val="ar_AE" w:bidi="ar_AE"/>
-          </w:rPr>
-          <w:rPr>
-            <w:color w:val="0000EE"/>
-            <w:u w:val="single"/>
-          </w:rPr>
-          <w:t>2:20</w:t>
-        </w:r>
-      </w:hyperlink>
+      <w:r>
+        <w:rPr>
+          <w:rtl/>
+          <w:cs/>
+          <w:lang w:val="ar_AE" w:bidi="ar_AE"/>
+        </w:rPr>
+        <w:t>2:20</w:t>
+      </w:r>
       <w:r>
         <w:rPr>
           <w:rtl/>
@@ -42296,20 +42182,14 @@
         </w:rPr>
         <w:t xml:space="preserve">انظر كيف قُمت بترجمة هذه العبارة في </w:t>
       </w:r>
-      <w:hyperlink r:id="rId24">
-        <w:r>
-          <w:rPr>
-            <w:rtl/>
-            <w:cs/>
-            <w:lang w:val="ar_AE" w:bidi="ar_AE"/>
-          </w:rPr>
-          <w:rPr>
-            <w:color w:val="0000EE"/>
-            <w:u w:val="single"/>
-          </w:rPr>
-          <w:t>4:5</w:t>
-        </w:r>
-      </w:hyperlink>
+      <w:r>
+        <w:rPr>
+          <w:rtl/>
+          <w:cs/>
+          <w:lang w:val="ar_AE" w:bidi="ar_AE"/>
+        </w:rPr>
+        <w:t>4:5</w:t>
+      </w:r>
       <w:r>
         <w:rPr>
           <w:rtl/>
@@ -42479,20 +42359,14 @@
         </w:rPr>
         <w:t xml:space="preserve">كاسم للإشارة إلى الشخص الذي مات. ربما تستخدم لغتك الصفات بنفس الطريقة. وإلا، فيمكنك ترجمة هذه الكلمة باستخدام عبارة مكافئة. انظر كيف قُمت بترجمتها في </w:t>
       </w:r>
-      <w:hyperlink r:id="rId24">
-        <w:r>
-          <w:rPr>
-            <w:rtl/>
-            <w:cs/>
-            <w:lang w:val="ar_AE" w:bidi="ar_AE"/>
-          </w:rPr>
-          <w:rPr>
-            <w:color w:val="0000EE"/>
-            <w:u w:val="single"/>
-          </w:rPr>
-          <w:t>4:5</w:t>
-        </w:r>
-      </w:hyperlink>
+      <w:r>
+        <w:rPr>
+          <w:rtl/>
+          <w:cs/>
+          <w:lang w:val="ar_AE" w:bidi="ar_AE"/>
+        </w:rPr>
+        <w:t>4:5</w:t>
+      </w:r>
       <w:r>
         <w:rPr>
           <w:rtl/>
@@ -44979,20 +44853,14 @@
         </w:rPr>
         <w:t xml:space="preserve"> إلى أن بوعز نفذ ما وعد به في الآية </w:t>
       </w:r>
-      <w:hyperlink r:id="rId25">
-        <w:r>
-          <w:rPr>
-            <w:rtl/>
-            <w:cs/>
-            <w:lang w:val="ar_AE" w:bidi="ar_AE"/>
-          </w:rPr>
-          <w:rPr>
-            <w:color w:val="0000EE"/>
-            <w:u w:val="single"/>
-          </w:rPr>
-          <w:t>4:10</w:t>
-        </w:r>
-      </w:hyperlink>
+      <w:r>
+        <w:rPr>
+          <w:rtl/>
+          <w:cs/>
+          <w:lang w:val="ar_AE" w:bidi="ar_AE"/>
+        </w:rPr>
+        <w:t>4:10</w:t>
+      </w:r>
       <w:r>
         <w:rPr>
           <w:rtl/>
@@ -45001,20 +44869,14 @@
         </w:rPr>
         <w:t xml:space="preserve">. استخدم أداة ربط مناسبة في لغتك توضح أن ما يلي هو نتيجة لما سبق. لا تشير هذه العبارة إلى أي شكل من أشكال العنف. إلى جانب العبارة التالية، بل انها تعني ببساطة أن بوعز تزوج من راعوث. استخدم أداة ربط مناسبة تشير إلى أن هذا الفعل من بوعز هو نتيجة للاتفاق المُبرم في الآية </w:t>
       </w:r>
-      <w:hyperlink r:id="rId25">
-        <w:r>
-          <w:rPr>
-            <w:rtl/>
-            <w:cs/>
-            <w:lang w:val="ar_AE" w:bidi="ar_AE"/>
-          </w:rPr>
-          <w:rPr>
-            <w:color w:val="0000EE"/>
-            <w:u w:val="single"/>
-          </w:rPr>
-          <w:t>4:10</w:t>
-        </w:r>
-      </w:hyperlink>
+      <w:r>
+        <w:rPr>
+          <w:rtl/>
+          <w:cs/>
+          <w:lang w:val="ar_AE" w:bidi="ar_AE"/>
+        </w:rPr>
+        <w:t>4:10</w:t>
+      </w:r>
       <w:r>
         <w:rPr>
           <w:rtl/>
@@ -45365,20 +45227,14 @@
         </w:rPr>
         <w:t xml:space="preserve"> المدينة كما ورد في </w:t>
       </w:r>
-      <w:hyperlink r:id="rId26">
-        <w:r>
-          <w:rPr>
-            <w:rtl/>
-            <w:cs/>
-            <w:lang w:val="ar_AE" w:bidi="ar_AE"/>
-          </w:rPr>
-          <w:rPr>
-            <w:color w:val="0000EE"/>
-            <w:u w:val="single"/>
-          </w:rPr>
-          <w:t>1:19</w:t>
-        </w:r>
-      </w:hyperlink>
+      <w:r>
+        <w:rPr>
+          <w:rtl/>
+          <w:cs/>
+          <w:lang w:val="ar_AE" w:bidi="ar_AE"/>
+        </w:rPr>
+        <w:t>1:19</w:t>
+      </w:r>
       <w:r>
         <w:rPr>
           <w:rtl/>
@@ -47999,20 +47855,14 @@
         </w:rPr>
         <w:t xml:space="preserve">بما أنه قد ذُكر سابقًا أن فارص هو ابن يهوذا، فإن الكاتب يواصل سرد سلسلة النسب المنحدرة من فارص. كانت الآية </w:t>
       </w:r>
-      <w:hyperlink r:id="rId27">
-        <w:r>
-          <w:rPr>
-            <w:rtl/>
-            <w:cs/>
-            <w:lang w:val="ar_AE" w:bidi="ar_AE"/>
-          </w:rPr>
-          <w:rPr>
-            <w:color w:val="0000EE"/>
-            <w:u w:val="single"/>
-          </w:rPr>
-          <w:t>4:17</w:t>
-        </w:r>
-      </w:hyperlink>
+      <w:r>
+        <w:rPr>
+          <w:rtl/>
+          <w:cs/>
+          <w:lang w:val="ar_AE" w:bidi="ar_AE"/>
+        </w:rPr>
+        <w:t>4:17</w:t>
+      </w:r>
       <w:r>
         <w:rPr>
           <w:rtl/>
@@ -48021,20 +47871,14 @@
         </w:rPr>
         <w:t xml:space="preserve"> خاتمة قصة نعمي وراعوث، وتبدأ الآية </w:t>
       </w:r>
-      <w:hyperlink r:id="rId28">
-        <w:r>
-          <w:rPr>
-            <w:rtl/>
-            <w:cs/>
-            <w:lang w:val="ar_AE" w:bidi="ar_AE"/>
-          </w:rPr>
-          <w:rPr>
-            <w:color w:val="0000EE"/>
-            <w:u w:val="single"/>
-          </w:rPr>
-          <w:t>4:18</w:t>
-        </w:r>
-      </w:hyperlink>
+      <w:r>
+        <w:rPr>
+          <w:rtl/>
+          <w:cs/>
+          <w:lang w:val="ar_AE" w:bidi="ar_AE"/>
+        </w:rPr>
+        <w:t>4:18</w:t>
+      </w:r>
       <w:r>
         <w:rPr>
           <w:rtl/>
@@ -48833,20 +48677,14 @@
         </w:rPr>
         <w:t xml:space="preserve"> في </w:t>
       </w:r>
-      <w:hyperlink r:id="rId27">
-        <w:r>
-          <w:rPr>
-            <w:rtl/>
-            <w:cs/>
-            <w:lang w:val="ar_AE" w:bidi="ar_AE"/>
-          </w:rPr>
-          <w:rPr>
-            <w:color w:val="0000EE"/>
-            <w:u w:val="single"/>
-          </w:rPr>
-          <w:t>4:17</w:t>
-        </w:r>
-      </w:hyperlink>
+      <w:r>
+        <w:rPr>
+          <w:rtl/>
+          <w:cs/>
+          <w:lang w:val="ar_AE" w:bidi="ar_AE"/>
+        </w:rPr>
+        <w:t>4:17</w:t>
+      </w:r>
       <w:r>
         <w:rPr>
           <w:rtl/>

</xml_diff>

<commit_message>
Add/update arb data for UWTranslationNotes
</commit_message>
<xml_diff>
--- a/arb/docx/08.content.docx
+++ b/arb/docx/08.content.docx
@@ -16456,7 +16456,15 @@
           <w:cs/>
           <w:lang w:val="ar_AE" w:bidi="ar_AE"/>
         </w:rPr>
-        <w:t>انظر: ترجمة المجهولات</w:t>
+        <w:t xml:space="preserve">انظر: </w:t>
+      </w:r>
+      <w:r>
+        <w:rPr>
+          <w:rtl/>
+          <w:cs/>
+          <w:lang w:val="ar_AE" w:bidi="ar_AE"/>
+        </w:rPr>
+        <w:t>ترجمة المجهولات</w:t>
       </w:r>
       <w:r>
         <w:rPr>

</xml_diff>